<commit_message>
ajustar altura de ventana en modo compacto y amplio a 660px
</commit_message>
<xml_diff>
--- a/test/test_prologoycomedia-titulosydramatisrepetidas.docx
+++ b/test/test_prologoycomedia-titulosydramatisrepetidas.docx
@@ -129,7 +129,35 @@
         <w:rPr>
           <w:lang w:val="es-ES"/>
         </w:rPr>
-        <w:t>hi rend="italic"</w:t>
+        <w:t xml:space="preserve">hi </w:t>
+      </w:r>
+      <w:proofErr w:type="spellStart"/>
+      <w:r>
+        <w:rPr>
+          <w:lang w:val="es-ES"/>
+        </w:rPr>
+        <w:t>rend</w:t>
+      </w:r>
+      <w:proofErr w:type="spellEnd"/>
+      <w:r>
+        <w:rPr>
+          <w:lang w:val="es-ES"/>
+        </w:rPr>
+        <w:t>="</w:t>
+      </w:r>
+      <w:proofErr w:type="spellStart"/>
+      <w:r>
+        <w:rPr>
+          <w:lang w:val="es-ES"/>
+        </w:rPr>
+        <w:t>italic</w:t>
+      </w:r>
+      <w:proofErr w:type="spellEnd"/>
+      <w:r>
+        <w:rPr>
+          <w:lang w:val="es-ES"/>
+        </w:rPr>
+        <w:t>"</w:t>
       </w:r>
       <w:r>
         <w:rPr>
@@ -375,8 +403,13 @@
             <w:tcW w:w="3209" w:type="dxa"/>
           </w:tcPr>
           <w:p>
-            <w:r>
-              <w:t>Número de verso</w:t>
+            <w:proofErr w:type="spellStart"/>
+            <w:r>
+              <w:t>Número</w:t>
+            </w:r>
+            <w:proofErr w:type="spellEnd"/>
+            <w:r>
+              <w:t xml:space="preserve"> de verso</w:t>
             </w:r>
           </w:p>
         </w:tc>
@@ -391,33 +424,43 @@
                 <w:iCs/>
               </w:rPr>
             </w:pPr>
+            <w:proofErr w:type="spellStart"/>
             <w:r>
               <w:rPr>
                 <w:i/>
                 <w:iCs/>
                 <w:lang w:val="pt-PT"/>
               </w:rPr>
-              <w:t>Penn A2A5B1</w:t>
-            </w:r>
-          </w:p>
-        </w:tc>
-        <w:tc>
-          <w:tcPr>
-            <w:tcW w:w="3210" w:type="dxa"/>
-          </w:tcPr>
-          <w:p>
-            <w:pPr>
-              <w:rPr>
-                <w:i/>
-                <w:iCs/>
-              </w:rPr>
-            </w:pPr>
+              <w:t>Penn</w:t>
+            </w:r>
+            <w:proofErr w:type="spellEnd"/>
             <w:r>
               <w:rPr>
                 <w:i/>
                 <w:iCs/>
                 <w:lang w:val="pt-PT"/>
               </w:rPr>
+              <w:t xml:space="preserve"> A2A5B1</w:t>
+            </w:r>
+          </w:p>
+        </w:tc>
+        <w:tc>
+          <w:tcPr>
+            <w:tcW w:w="3210" w:type="dxa"/>
+          </w:tcPr>
+          <w:p>
+            <w:pPr>
+              <w:rPr>
+                <w:i/>
+                <w:iCs/>
+              </w:rPr>
+            </w:pPr>
+            <w:r>
+              <w:rPr>
+                <w:i/>
+                <w:iCs/>
+                <w:lang w:val="pt-PT"/>
+              </w:rPr>
               <w:t>A1A3A4</w:t>
             </w:r>
           </w:p>
@@ -455,11 +498,19 @@
             <w:tcW w:w="3210" w:type="dxa"/>
           </w:tcPr>
           <w:p>
+            <w:proofErr w:type="spellStart"/>
             <w:r>
               <w:rPr>
                 <w:lang w:val="pt-PT"/>
               </w:rPr>
-              <w:t>orque [errata]</w:t>
+              <w:t>orque</w:t>
+            </w:r>
+            <w:proofErr w:type="spellEnd"/>
+            <w:r>
+              <w:rPr>
+                <w:lang w:val="pt-PT"/>
+              </w:rPr>
+              <w:t xml:space="preserve"> [errata]</w:t>
             </w:r>
           </w:p>
         </w:tc>
@@ -483,11 +534,19 @@
             <w:tcW w:w="3209" w:type="dxa"/>
           </w:tcPr>
           <w:p>
+            <w:proofErr w:type="spellStart"/>
             <w:r>
               <w:rPr>
                 <w:lang w:val="es-ES"/>
               </w:rPr>
-              <w:t>aua [errata]</w:t>
+              <w:t>aua</w:t>
+            </w:r>
+            <w:proofErr w:type="spellEnd"/>
+            <w:r>
+              <w:rPr>
+                <w:lang w:val="es-ES"/>
+              </w:rPr>
+              <w:t xml:space="preserve"> [errata]</w:t>
             </w:r>
           </w:p>
         </w:tc>
@@ -496,12 +555,14 @@
             <w:tcW w:w="3210" w:type="dxa"/>
           </w:tcPr>
           <w:p>
+            <w:proofErr w:type="spellStart"/>
             <w:r>
               <w:rPr>
                 <w:lang w:val="es-ES"/>
               </w:rPr>
               <w:t>auia</w:t>
             </w:r>
+            <w:proofErr w:type="spellEnd"/>
           </w:p>
         </w:tc>
       </w:tr>
@@ -524,11 +585,19 @@
             <w:tcW w:w="3209" w:type="dxa"/>
           </w:tcPr>
           <w:p>
+            <w:proofErr w:type="spellStart"/>
             <w:r>
               <w:rPr>
                 <w:lang w:val="es-ES"/>
               </w:rPr>
-              <w:t>om [errata]</w:t>
+              <w:t>om</w:t>
+            </w:r>
+            <w:proofErr w:type="spellEnd"/>
+            <w:r>
+              <w:rPr>
+                <w:lang w:val="es-ES"/>
+              </w:rPr>
+              <w:t xml:space="preserve"> [errata]</w:t>
             </w:r>
           </w:p>
         </w:tc>
@@ -565,11 +634,19 @@
             <w:tcW w:w="3209" w:type="dxa"/>
           </w:tcPr>
           <w:p>
+            <w:proofErr w:type="spellStart"/>
             <w:r>
               <w:rPr>
                 <w:lang w:val="es-ES"/>
               </w:rPr>
-              <w:t>Esteuan es</w:t>
+              <w:t>Esteuan</w:t>
+            </w:r>
+            <w:proofErr w:type="spellEnd"/>
+            <w:r>
+              <w:rPr>
+                <w:lang w:val="es-ES"/>
+              </w:rPr>
+              <w:t xml:space="preserve"> es</w:t>
             </w:r>
           </w:p>
         </w:tc>
@@ -578,12 +655,14 @@
             <w:tcW w:w="3210" w:type="dxa"/>
           </w:tcPr>
           <w:p>
+            <w:proofErr w:type="spellStart"/>
             <w:r>
               <w:rPr>
                 <w:lang w:val="es-ES"/>
               </w:rPr>
               <w:t>Esteuañez</w:t>
             </w:r>
+            <w:proofErr w:type="spellEnd"/>
           </w:p>
         </w:tc>
       </w:tr>
@@ -619,12 +698,14 @@
             <w:tcW w:w="3210" w:type="dxa"/>
           </w:tcPr>
           <w:p>
+            <w:proofErr w:type="spellStart"/>
             <w:r>
               <w:rPr>
                 <w:lang w:val="es-ES"/>
               </w:rPr>
               <w:t>huuo</w:t>
             </w:r>
+            <w:proofErr w:type="spellEnd"/>
           </w:p>
         </w:tc>
       </w:tr>
@@ -754,6 +835,7 @@
                 <w:lang w:eastAsia="it-IT"/>
               </w:rPr>
             </w:pPr>
+            <w:proofErr w:type="spellStart"/>
             <w:r>
               <w:rPr>
                 <w:rFonts w:ascii="Arial" w:eastAsia="Times New Roman" w:hAnsi="Arial" w:cs="Arial"/>
@@ -765,6 +847,7 @@
               </w:rPr>
               <w:t>Estrofa</w:t>
             </w:r>
+            <w:proofErr w:type="spellEnd"/>
           </w:p>
         </w:tc>
         <w:tc>
@@ -803,12 +886,21 @@
             <w:tcW w:w="2841" w:type="dxa"/>
           </w:tcPr>
           <w:p>
+            <w:proofErr w:type="spellStart"/>
             <w:r>
               <w:rPr>
                 <w:b/>
                 <w:i/>
               </w:rPr>
-              <w:t>Acto primero</w:t>
+              <w:t>Acto</w:t>
+            </w:r>
+            <w:proofErr w:type="spellEnd"/>
+            <w:r>
+              <w:rPr>
+                <w:b/>
+                <w:i/>
+              </w:rPr>
+              <w:t xml:space="preserve"> primero</w:t>
             </w:r>
           </w:p>
         </w:tc>
@@ -882,8 +974,21 @@
           </w:tcPr>
           <w:p>
             <w:r>
-              <w:t>romance en – eo</w:t>
-            </w:r>
+              <w:t xml:space="preserve">romance </w:t>
+            </w:r>
+            <w:proofErr w:type="spellStart"/>
+            <w:r>
+              <w:t>en</w:t>
+            </w:r>
+            <w:proofErr w:type="spellEnd"/>
+            <w:r>
+              <w:t xml:space="preserve"> – </w:t>
+            </w:r>
+            <w:proofErr w:type="spellStart"/>
+            <w:r>
+              <w:t>eo</w:t>
+            </w:r>
+            <w:proofErr w:type="spellEnd"/>
           </w:p>
         </w:tc>
         <w:tc>
@@ -913,9 +1018,19 @@
             <w:tcW w:w="2841" w:type="dxa"/>
           </w:tcPr>
           <w:p>
-            <w:r>
-              <w:t>endecasílabos sueltos</w:t>
-            </w:r>
+            <w:proofErr w:type="spellStart"/>
+            <w:r>
+              <w:t>endecasílabos</w:t>
+            </w:r>
+            <w:proofErr w:type="spellEnd"/>
+            <w:r>
+              <w:t xml:space="preserve"> </w:t>
+            </w:r>
+            <w:proofErr w:type="spellStart"/>
+            <w:r>
+              <w:t>sueltos</w:t>
+            </w:r>
+            <w:proofErr w:type="spellEnd"/>
           </w:p>
         </w:tc>
         <w:tc>
@@ -945,9 +1060,11 @@
             <w:tcW w:w="2841" w:type="dxa"/>
           </w:tcPr>
           <w:p>
+            <w:proofErr w:type="spellStart"/>
             <w:r>
               <w:t>soneto</w:t>
             </w:r>
+            <w:proofErr w:type="spellEnd"/>
           </w:p>
         </w:tc>
         <w:tc>
@@ -1040,18 +1157,27 @@
             <w:tcW w:w="2841" w:type="dxa"/>
           </w:tcPr>
           <w:p>
+            <w:proofErr w:type="spellStart"/>
             <w:r>
               <w:rPr>
                 <w:b/>
                 <w:i/>
               </w:rPr>
-              <w:t xml:space="preserve">Acto </w:t>
-            </w:r>
+              <w:t>Acto</w:t>
+            </w:r>
+            <w:proofErr w:type="spellEnd"/>
             <w:r>
               <w:rPr>
                 <w:b/>
                 <w:i/>
               </w:rPr>
+              <w:t xml:space="preserve"> </w:t>
+            </w:r>
+            <w:r>
+              <w:rPr>
+                <w:b/>
+                <w:i/>
+              </w:rPr>
               <w:t>Segundo</w:t>
             </w:r>
           </w:p>
@@ -1085,9 +1211,11 @@
             <w:tcW w:w="2841" w:type="dxa"/>
           </w:tcPr>
           <w:p>
+            <w:proofErr w:type="spellStart"/>
             <w:r>
               <w:t>quintillas</w:t>
             </w:r>
+            <w:proofErr w:type="spellEnd"/>
           </w:p>
         </w:tc>
         <w:tc>
@@ -1245,18 +1373,27 @@
             <w:tcW w:w="2841" w:type="dxa"/>
           </w:tcPr>
           <w:p>
+            <w:proofErr w:type="spellStart"/>
             <w:r>
               <w:rPr>
                 <w:b/>
                 <w:i/>
               </w:rPr>
-              <w:t xml:space="preserve">Acto </w:t>
-            </w:r>
+              <w:t>Acto</w:t>
+            </w:r>
+            <w:proofErr w:type="spellEnd"/>
             <w:r>
               <w:rPr>
                 <w:b/>
                 <w:i/>
               </w:rPr>
+              <w:t xml:space="preserve"> </w:t>
+            </w:r>
+            <w:r>
+              <w:rPr>
+                <w:b/>
+                <w:i/>
+              </w:rPr>
               <w:t>Tercero</w:t>
             </w:r>
           </w:p>
@@ -1322,8 +1459,13 @@
             <w:tcW w:w="2841" w:type="dxa"/>
           </w:tcPr>
           <w:p>
-            <w:r>
-              <w:t>octavas reales</w:t>
+            <w:proofErr w:type="spellStart"/>
+            <w:r>
+              <w:t>octavas</w:t>
+            </w:r>
+            <w:proofErr w:type="spellEnd"/>
+            <w:r>
+              <w:t xml:space="preserve"> reales</w:t>
             </w:r>
           </w:p>
         </w:tc>
@@ -1360,9 +1502,19 @@
             <w:tcW w:w="2841" w:type="dxa"/>
           </w:tcPr>
           <w:p>
-            <w:r>
-              <w:t>tercetos encadenados</w:t>
-            </w:r>
+            <w:proofErr w:type="spellStart"/>
+            <w:r>
+              <w:t>tercetos</w:t>
+            </w:r>
+            <w:proofErr w:type="spellEnd"/>
+            <w:r>
+              <w:t xml:space="preserve"> </w:t>
+            </w:r>
+            <w:proofErr w:type="spellStart"/>
+            <w:r>
+              <w:t>encadenados</w:t>
+            </w:r>
+            <w:proofErr w:type="spellEnd"/>
           </w:p>
         </w:tc>
         <w:tc>
@@ -1461,6 +1613,7 @@
                 <w:i/>
               </w:rPr>
             </w:pPr>
+            <w:proofErr w:type="spellStart"/>
             <w:r>
               <w:rPr>
                 <w:b/>
@@ -1468,6 +1621,7 @@
               </w:rPr>
               <w:t>Resumen</w:t>
             </w:r>
+            <w:proofErr w:type="spellEnd"/>
           </w:p>
         </w:tc>
         <w:tc>
@@ -1552,9 +1706,11 @@
             <w:tcW w:w="2841" w:type="dxa"/>
           </w:tcPr>
           <w:p>
+            <w:proofErr w:type="spellStart"/>
             <w:r>
               <w:t>quintillas</w:t>
             </w:r>
+            <w:proofErr w:type="spellEnd"/>
           </w:p>
         </w:tc>
         <w:tc>
@@ -1616,9 +1772,19 @@
             <w:tcW w:w="2841" w:type="dxa"/>
           </w:tcPr>
           <w:p>
-            <w:r>
-              <w:t>endecasílabos sueltos</w:t>
-            </w:r>
+            <w:proofErr w:type="spellStart"/>
+            <w:r>
+              <w:t>endecasílabos</w:t>
+            </w:r>
+            <w:proofErr w:type="spellEnd"/>
+            <w:r>
+              <w:t xml:space="preserve"> </w:t>
+            </w:r>
+            <w:proofErr w:type="spellStart"/>
+            <w:r>
+              <w:t>sueltos</w:t>
+            </w:r>
+            <w:proofErr w:type="spellEnd"/>
           </w:p>
         </w:tc>
         <w:tc>
@@ -1648,8 +1814,13 @@
             <w:tcW w:w="2841" w:type="dxa"/>
           </w:tcPr>
           <w:p>
-            <w:r>
-              <w:t>octavas reales</w:t>
+            <w:proofErr w:type="spellStart"/>
+            <w:r>
+              <w:t>octavas</w:t>
+            </w:r>
+            <w:proofErr w:type="spellEnd"/>
+            <w:r>
+              <w:t xml:space="preserve"> reales</w:t>
             </w:r>
           </w:p>
         </w:tc>
@@ -1680,9 +1851,19 @@
             <w:tcW w:w="2841" w:type="dxa"/>
           </w:tcPr>
           <w:p>
-            <w:r>
-              <w:t>tercetos encadenados</w:t>
-            </w:r>
+            <w:proofErr w:type="spellStart"/>
+            <w:r>
+              <w:t>tercetos</w:t>
+            </w:r>
+            <w:proofErr w:type="spellEnd"/>
+            <w:r>
+              <w:t xml:space="preserve"> </w:t>
+            </w:r>
+            <w:proofErr w:type="spellStart"/>
+            <w:r>
+              <w:t>encadenados</w:t>
+            </w:r>
+            <w:proofErr w:type="spellEnd"/>
           </w:p>
         </w:tc>
         <w:tc>
@@ -1744,9 +1925,11 @@
             <w:tcW w:w="2841" w:type="dxa"/>
           </w:tcPr>
           <w:p>
+            <w:proofErr w:type="spellStart"/>
             <w:r>
               <w:t>soneto</w:t>
             </w:r>
+            <w:proofErr w:type="spellEnd"/>
           </w:p>
         </w:tc>
         <w:tc>
@@ -2031,10 +2214,34 @@
         <w:t xml:space="preserve"> explicativas o entradas de aparato crítico</w:t>
       </w:r>
       <w:r>
-        <w:t>, ahora no van como notas al pie, sino que están en un archivo aparte. Dado que no se pueden usar números como en los versos, para las notas en las partes sin numerar (títulos, dedicatoria, dramatis personae, acotaciones, etc.), se usa @ delante la @palabra a la que afecta, o última palabra de la frase, de forma que se identifique después dónde va la llamada a la nota.</w:t>
-      </w:r>
-      <w:r>
-        <w:t xml:space="preserve"> Si se trata de una entrada de aparato crítico, igual pero con %. Si una @%palabra lleva una nota y también una entrada de aparato, se usan ambos símbolos en ese orden.</w:t>
+        <w:t xml:space="preserve">, ahora no van como notas al pie, sino que están en un archivo aparte. Dado que no se pueden usar números como en los versos, para las notas en las partes sin numerar (títulos, dedicatoria, </w:t>
+      </w:r>
+      <w:proofErr w:type="spellStart"/>
+      <w:r>
+        <w:t>dramatis</w:t>
+      </w:r>
+      <w:proofErr w:type="spellEnd"/>
+      <w:r>
+        <w:t xml:space="preserve"> </w:t>
+      </w:r>
+      <w:proofErr w:type="spellStart"/>
+      <w:r>
+        <w:t>personae</w:t>
+      </w:r>
+      <w:proofErr w:type="spellEnd"/>
+      <w:r>
+        <w:t>, acotaciones, etc.), se usa @ delante la @palabra a la que afecta, o última palabra de la frase, de forma que se identifique después dónde va la llamada a la nota.</w:t>
+      </w:r>
+      <w:r>
+        <w:t xml:space="preserve"> Si se trata de una entrada de aparato crítico, </w:t>
+      </w:r>
+      <w:proofErr w:type="gramStart"/>
+      <w:r>
+        <w:t>igual</w:t>
+      </w:r>
+      <w:proofErr w:type="gramEnd"/>
+      <w:r>
+        <w:t xml:space="preserve"> pero con %. Si una @%palabra lleva una nota y también una entrada de aparato, se usan ambos símbolos en ese orden.</w:t>
       </w:r>
     </w:p>
     <w:p>
@@ -2617,8 +2824,13 @@
       <w:pPr>
         <w:pStyle w:val="Partidofinal"/>
       </w:pPr>
-      <w:r>
-        <w:t xml:space="preserve">si hay unión,  </w:t>
+      <w:proofErr w:type="spellStart"/>
+      <w:r>
+        <w:t>si</w:t>
+      </w:r>
+      <w:proofErr w:type="spellEnd"/>
+      <w:r>
+        <w:t xml:space="preserve"> hay unión,  </w:t>
       </w:r>
     </w:p>
     <w:p>
@@ -2983,20 +3195,14 @@
         <w:pStyle w:val="Titulocomedia"/>
         <w:jc w:val="left"/>
         <w:rPr>
-          <w:lang w:val="pt-PT"/>
-        </w:rPr>
-      </w:pPr>
-      <w:r>
-        <w:rPr>
-          <w:lang w:val="pt-PT"/>
-        </w:rPr>
-        <w:t xml:space="preserve">Título de la %Tragicomedia </w:t>
-      </w:r>
-      <w:r>
-        <w:rPr>
-          <w:lang w:val="pt-PT"/>
-        </w:rPr>
-        <w:t>repetido</w:t>
+          <w:lang w:val="es-ES"/>
+        </w:rPr>
+      </w:pPr>
+      <w:r>
+        <w:rPr>
+          <w:lang w:val="es-ES"/>
+        </w:rPr>
+        <w:t>Título de la %Tragicomedia repetido</w:t>
       </w:r>
     </w:p>
     <w:p>
@@ -3113,13 +3319,7 @@
         <w:rPr>
           <w:lang w:val="es-ES"/>
         </w:rPr>
-        <w:t>A</w:t>
-      </w:r>
-      <w:r>
-        <w:rPr>
-          <w:lang w:val="es-ES"/>
-        </w:rPr>
-        <w:t>cotación</w:t>
+        <w:t>Acotación</w:t>
       </w:r>
     </w:p>
     <w:p>
@@ -3141,14 +3341,8 @@
     <w:p>
       <w:pPr>
         <w:pStyle w:val="Verso"/>
-        <w:rPr>
-          <w:lang w:val="pt-PT"/>
-        </w:rPr>
-      </w:pPr>
-      <w:r>
-        <w:rPr>
-          <w:lang w:val="pt-PT"/>
-        </w:rPr>
+      </w:pPr>
+      <w:r>
         <w:t>Verso</w:t>
       </w:r>
     </w:p>
@@ -3157,12 +3351,12 @@
         <w:pStyle w:val="Titulocomedia"/>
         <w:jc w:val="left"/>
         <w:rPr>
-          <w:lang w:val="pt-PT"/>
-        </w:rPr>
-      </w:pPr>
-      <w:r>
-        <w:rPr>
-          <w:lang w:val="pt-PT"/>
+          <w:lang w:val="es-ES"/>
+        </w:rPr>
+      </w:pPr>
+      <w:r>
+        <w:rPr>
+          <w:lang w:val="es-ES"/>
         </w:rPr>
         <w:t>Título de la %Tragicomedia repetido</w:t>
       </w:r>
@@ -3172,12 +3366,12 @@
         <w:pStyle w:val="Titulocomedia"/>
         <w:jc w:val="left"/>
         <w:rPr>
-          <w:lang w:val="pt-PT"/>
-        </w:rPr>
-      </w:pPr>
-      <w:r>
-        <w:rPr>
-          <w:lang w:val="pt-PT"/>
+          <w:lang w:val="es-ES"/>
+        </w:rPr>
+      </w:pPr>
+      <w:r>
+        <w:rPr>
+          <w:lang w:val="es-ES"/>
         </w:rPr>
         <w:t>subtítulo repetido</w:t>
       </w:r>
@@ -3257,10 +3451,7 @@
         <w:pStyle w:val="Acto"/>
       </w:pPr>
       <w:r>
-        <w:t xml:space="preserve">Acto </w:t>
-      </w:r>
-      <w:r>
-        <w:t>TERCERO</w:t>
+        <w:t>Acto TERCERO</w:t>
       </w:r>
     </w:p>
     <w:p>

</xml_diff>